<commit_message>
Update and rename files
</commit_message>
<xml_diff>
--- a/3_Outreach/Fyler-template.docx
+++ b/3_Outreach/Fyler-template.docx
@@ -5079,7 +5079,7 @@
           <w:szCs w:val="40"/>
         </w:rPr>
         <w:drawing>
-          <wp:anchor distT="0" distB="0" distL="114300" distR="114300" simplePos="0" relativeHeight="251673600" behindDoc="0" locked="0" layoutInCell="1" allowOverlap="1" wp14:anchorId="0554B3C4" wp14:editId="5034DDD4">
+          <wp:anchor distT="0" distB="0" distL="114300" distR="114300" simplePos="0" relativeHeight="251673600" behindDoc="0" locked="0" layoutInCell="1" allowOverlap="1" wp14:anchorId="0554B3C4" wp14:editId="327128FC">
             <wp:simplePos x="0" y="0"/>
             <wp:positionH relativeFrom="page">
               <wp:posOffset>168079</wp:posOffset>
@@ -5571,7 +5571,7 @@
           <w:noProof/>
         </w:rPr>
         <w:drawing>
-          <wp:anchor distT="0" distB="0" distL="114300" distR="114300" simplePos="0" relativeHeight="251676672" behindDoc="0" locked="0" layoutInCell="1" allowOverlap="1" wp14:anchorId="2C93D359" wp14:editId="0AF766F1">
+          <wp:anchor distT="0" distB="0" distL="114300" distR="114300" simplePos="0" relativeHeight="251676672" behindDoc="0" locked="0" layoutInCell="1" allowOverlap="1" wp14:anchorId="2C93D359" wp14:editId="3B0463B0">
             <wp:simplePos x="0" y="0"/>
             <wp:positionH relativeFrom="page">
               <wp:posOffset>158115</wp:posOffset>
@@ -5640,7 +5640,7 @@
           <w:szCs w:val="40"/>
         </w:rPr>
         <w:drawing>
-          <wp:anchor distT="0" distB="0" distL="114300" distR="114300" simplePos="0" relativeHeight="251671552" behindDoc="0" locked="0" layoutInCell="1" allowOverlap="1" wp14:anchorId="0AED75C8" wp14:editId="7B7D24BD">
+          <wp:anchor distT="0" distB="0" distL="114300" distR="114300" simplePos="0" relativeHeight="251671552" behindDoc="0" locked="0" layoutInCell="1" allowOverlap="1" wp14:anchorId="0AED75C8" wp14:editId="7C71F657">
             <wp:simplePos x="0" y="0"/>
             <wp:positionH relativeFrom="page">
               <wp:align>right</wp:align>
@@ -6354,7 +6354,7 @@
                             <wp:extent cx="1667510" cy="951230"/>
                             <wp:effectExtent l="0" t="0" r="8890" b="1270"/>
                             <wp:docPr id="16" name="Picture 16" descr="A collage of people&#10;&#10;Description automatically generated with low confidence">
-                              <a:hlinkClick xmlns:a="http://schemas.openxmlformats.org/drawingml/2006/main" r:id="rId16"/>
+                              <a:hlinkClick xmlns:a="http://schemas.openxmlformats.org/drawingml/2006/main" r:id="rId19"/>
                             </wp:docPr>
                             <wp:cNvGraphicFramePr>
                               <a:graphicFrameLocks xmlns:a="http://schemas.openxmlformats.org/drawingml/2006/main" noChangeAspect="1"/>
@@ -6364,14 +6364,14 @@
                                 <pic:pic xmlns:pic="http://schemas.openxmlformats.org/drawingml/2006/picture">
                                   <pic:nvPicPr>
                                     <pic:cNvPr id="16" name="Picture 16" descr="A collage of people&#10;&#10;Description automatically generated with low confidence">
-                                      <a:hlinkClick r:id="rId16"/>
+                                      <a:hlinkClick r:id="rId19"/>
                                     </pic:cNvPr>
                                     <pic:cNvPicPr>
                                       <a:picLocks noChangeAspect="1"/>
                                     </pic:cNvPicPr>
                                   </pic:nvPicPr>
                                   <pic:blipFill>
-                                    <a:blip r:embed="rId17" cstate="print">
+                                    <a:blip r:embed="rId20" cstate="print">
                                       <a:extLst>
                                         <a:ext uri="{28A0092B-C50C-407E-A947-70E740481C1C}">
                                           <a14:useLocalDpi xmlns:a14="http://schemas.microsoft.com/office/drawing/2010/main" val="0"/>
@@ -6430,7 +6430,7 @@
                         </w:rPr>
                         <w:t xml:space="preserve"> </w:t>
                       </w:r>
-                      <w:hyperlink r:id="rId19" w:history="1">
+                      <w:hyperlink r:id="rId21" w:history="1">
                         <w:r>
                           <w:rPr>
                             <w:rStyle w:val="Hyperlink"/>
@@ -7031,7 +7031,7 @@
                                   <wp:extent cx="1414780" cy="849630"/>
                                   <wp:effectExtent l="0" t="0" r="0" b="7620"/>
                                   <wp:docPr id="9" name="Picture 9" descr="Graphical user interface, background pattern&#10;&#10;Description automatically generated">
-                                    <a:hlinkClick xmlns:a="http://schemas.openxmlformats.org/drawingml/2006/main" r:id="rId20"/>
+                                    <a:hlinkClick xmlns:a="http://schemas.openxmlformats.org/drawingml/2006/main" r:id="rId22"/>
                                   </wp:docPr>
                                   <wp:cNvGraphicFramePr>
                                     <a:graphicFrameLocks xmlns:a="http://schemas.openxmlformats.org/drawingml/2006/main" noChangeAspect="1"/>
@@ -7041,14 +7041,14 @@
                                       <pic:pic xmlns:pic="http://schemas.openxmlformats.org/drawingml/2006/picture">
                                         <pic:nvPicPr>
                                           <pic:cNvPr id="9" name="Picture 9" descr="Graphical user interface, background pattern&#10;&#10;Description automatically generated">
-                                            <a:hlinkClick r:id="rId20"/>
+                                            <a:hlinkClick r:id="rId22"/>
                                           </pic:cNvPr>
                                           <pic:cNvPicPr>
                                             <a:picLocks noChangeAspect="1"/>
                                           </pic:cNvPicPr>
                                         </pic:nvPicPr>
                                         <pic:blipFill>
-                                          <a:blip r:embed="rId21">
+                                          <a:blip r:embed="rId23">
                                             <a:extLst>
                                               <a:ext uri="{28A0092B-C50C-407E-A947-70E740481C1C}">
                                                 <a14:useLocalDpi xmlns:a14="http://schemas.microsoft.com/office/drawing/2010/main" val="0"/>
@@ -7112,7 +7112,7 @@
                               </w:rPr>
                               <w:t xml:space="preserve">ource: </w:t>
                             </w:r>
-                            <w:hyperlink r:id="rId22" w:history="1">
+                            <w:hyperlink r:id="rId24" w:history="1">
                               <w:r>
                                 <w:rPr>
                                   <w:rStyle w:val="Hyperlink"/>
@@ -7253,7 +7253,7 @@
                             <wp:extent cx="1414780" cy="849630"/>
                             <wp:effectExtent l="0" t="0" r="0" b="7620"/>
                             <wp:docPr id="9" name="Picture 9" descr="Graphical user interface, background pattern&#10;&#10;Description automatically generated">
-                              <a:hlinkClick xmlns:a="http://schemas.openxmlformats.org/drawingml/2006/main" r:id="rId20"/>
+                              <a:hlinkClick xmlns:a="http://schemas.openxmlformats.org/drawingml/2006/main" r:id="rId25"/>
                             </wp:docPr>
                             <wp:cNvGraphicFramePr>
                               <a:graphicFrameLocks xmlns:a="http://schemas.openxmlformats.org/drawingml/2006/main" noChangeAspect="1"/>
@@ -7263,14 +7263,14 @@
                                 <pic:pic xmlns:pic="http://schemas.openxmlformats.org/drawingml/2006/picture">
                                   <pic:nvPicPr>
                                     <pic:cNvPr id="9" name="Picture 9" descr="Graphical user interface, background pattern&#10;&#10;Description automatically generated">
-                                      <a:hlinkClick r:id="rId22"/>
+                                      <a:hlinkClick r:id="rId26"/>
                                     </pic:cNvPr>
                                     <pic:cNvPicPr>
                                       <a:picLocks noChangeAspect="1"/>
                                     </pic:cNvPicPr>
                                   </pic:nvPicPr>
                                   <pic:blipFill>
-                                    <a:blip r:embed="rId21">
+                                    <a:blip r:embed="rId27">
                                       <a:extLst>
                                         <a:ext uri="{28A0092B-C50C-407E-A947-70E740481C1C}">
                                           <a14:useLocalDpi xmlns:a14="http://schemas.microsoft.com/office/drawing/2010/main" val="0"/>
@@ -7334,7 +7334,7 @@
                         </w:rPr>
                         <w:t xml:space="preserve">ource: </w:t>
                       </w:r>
-                      <w:hyperlink r:id="rId23" w:history="1">
+                      <w:hyperlink r:id="rId28" w:history="1">
                         <w:r>
                           <w:rPr>
                             <w:rStyle w:val="Hyperlink"/>
@@ -9093,11 +9093,11 @@
                     <pic:cNvPicPr/>
                   </pic:nvPicPr>
                   <pic:blipFill>
-                    <a:blip r:embed="rId24" cstate="print">
+                    <a:blip r:embed="rId29" cstate="print">
                       <a:extLst>
                         <a:ext uri="{BEBA8EAE-BF5A-486C-A8C5-ECC9F3942E4B}">
                           <a14:imgProps xmlns:a14="http://schemas.microsoft.com/office/drawing/2010/main">
-                            <a14:imgLayer r:embed="rId25">
+                            <a14:imgLayer r:embed="rId30">
                               <a14:imgEffect>
                                 <a14:backgroundRemoval t="10000" b="90000" l="10000" r="90000"/>
                               </a14:imgEffect>
@@ -9245,14 +9245,14 @@
                               <w:spacing w:after="0" w:line="240" w:lineRule="auto"/>
                               <w:ind w:left="180" w:hanging="180"/>
                             </w:pPr>
-                            <w:hyperlink r:id="rId26" w:history="1">
+                            <w:hyperlink r:id="rId31" w:history="1">
                               <w:r>
                                 <w:rPr>
                                   <w:rStyle w:val="Hyperlink"/>
                                   <w:sz w:val="20"/>
                                   <w:szCs w:val="20"/>
                                 </w:rPr>
-                                <w:t>http://babbage.se.edu/itteam</w:t>
+                                <w:t>http://www.your.edu/itteam</w:t>
                               </w:r>
                             </w:hyperlink>
                             <w:r>
@@ -9299,7 +9299,7 @@
                                 <w:sz w:val="18"/>
                               </w:rPr>
                             </w:pPr>
-                            <w:hyperlink r:id="rId27" w:history="1">
+                            <w:hyperlink r:id="rId32" w:history="1">
                               <w:r>
                                 <w:rPr>
                                   <w:rStyle w:val="Hyperlink"/>
@@ -9334,7 +9334,11 @@
           </mc:Choice>
           <mc:Fallback>
             <w:pict>
-              <v:shape w14:anchorId="3374D360" id="_x0000_s1037" type="#_x0000_t202" style="position:absolute;margin-left:453.8pt;margin-top:216.75pt;width:153.8pt;height:110.6pt;z-index:251704320;visibility:visible;mso-wrap-style:square;mso-width-percent:0;mso-height-percent:0;mso-wrap-distance-left:9pt;mso-wrap-distance-top:3.6pt;mso-wrap-distance-right:9pt;mso-wrap-distance-bottom:3.6pt;mso-position-horizontal:absolute;mso-position-horizontal-relative:page;mso-position-vertical:absolute;mso-position-vertical-relative:text;mso-width-percent:0;mso-height-percent:0;mso-width-relative:margin;mso-height-relative:margin;v-text-anchor:top" o:gfxdata="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" filled="f" stroked="f">
+              <v:shapetype w14:anchorId="3374D360" id="_x0000_t202" coordsize="21600,21600" o:spt="202" path="m,l,21600r21600,l21600,xe">
+                <v:stroke joinstyle="miter"/>
+                <v:path gradientshapeok="t" o:connecttype="rect"/>
+              </v:shapetype>
+              <v:shape id="_x0000_s1037" type="#_x0000_t202" style="position:absolute;margin-left:453.8pt;margin-top:216.75pt;width:153.8pt;height:110.6pt;z-index:251704320;visibility:visible;mso-wrap-style:square;mso-width-percent:0;mso-height-percent:0;mso-wrap-distance-left:9pt;mso-wrap-distance-top:3.6pt;mso-wrap-distance-right:9pt;mso-wrap-distance-bottom:3.6pt;mso-position-horizontal:absolute;mso-position-horizontal-relative:page;mso-position-vertical:absolute;mso-position-vertical-relative:text;mso-width-percent:0;mso-height-percent:0;mso-width-relative:margin;mso-height-relative:margin;v-text-anchor:top" o:gfxdata="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" filled="f" stroked="f">
                 <v:textbox style="mso-fit-shape-to-text:t">
                   <w:txbxContent>
                     <w:p>
@@ -9400,14 +9404,14 @@
                         <w:spacing w:after="0" w:line="240" w:lineRule="auto"/>
                         <w:ind w:left="180" w:hanging="180"/>
                       </w:pPr>
-                      <w:hyperlink r:id="rId28" w:history="1">
+                      <w:hyperlink r:id="rId33" w:history="1">
                         <w:r>
                           <w:rPr>
                             <w:rStyle w:val="Hyperlink"/>
                             <w:sz w:val="20"/>
                             <w:szCs w:val="20"/>
                           </w:rPr>
-                          <w:t>http://babbage.se.edu/itteam</w:t>
+                          <w:t>http://www.your.edu/itteam</w:t>
                         </w:r>
                       </w:hyperlink>
                       <w:r>
@@ -9454,7 +9458,7 @@
                           <w:sz w:val="18"/>
                         </w:rPr>
                       </w:pPr>
-                      <w:hyperlink r:id="rId29" w:history="1">
+                      <w:hyperlink r:id="rId34" w:history="1">
                         <w:r>
                           <w:rPr>
                             <w:rStyle w:val="Hyperlink"/>
@@ -9660,7 +9664,7 @@
                                   <wp:extent cx="1655445" cy="955040"/>
                                   <wp:effectExtent l="0" t="0" r="1905" b="0"/>
                                   <wp:docPr id="7" name="Picture 7" descr="A picture containing text, electronics&#10;&#10;Description automatically generated">
-                                    <a:hlinkClick xmlns:a="http://schemas.openxmlformats.org/drawingml/2006/main" r:id="rId30"/>
+                                    <a:hlinkClick xmlns:a="http://schemas.openxmlformats.org/drawingml/2006/main" r:id="rId35"/>
                                   </wp:docPr>
                                   <wp:cNvGraphicFramePr>
                                     <a:graphicFrameLocks xmlns:a="http://schemas.openxmlformats.org/drawingml/2006/main" noChangeAspect="1"/>
@@ -9670,14 +9674,14 @@
                                       <pic:pic xmlns:pic="http://schemas.openxmlformats.org/drawingml/2006/picture">
                                         <pic:nvPicPr>
                                           <pic:cNvPr id="11" name="Picture 11" descr="A picture containing text, electronics&#10;&#10;Description automatically generated">
-                                            <a:hlinkClick r:id="rId30"/>
+                                            <a:hlinkClick r:id="rId35"/>
                                           </pic:cNvPr>
                                           <pic:cNvPicPr>
                                             <a:picLocks noChangeAspect="1"/>
                                           </pic:cNvPicPr>
                                         </pic:nvPicPr>
                                         <pic:blipFill>
-                                          <a:blip r:embed="rId31">
+                                          <a:blip r:embed="rId36">
                                             <a:extLst>
                                               <a:ext uri="{28A0092B-C50C-407E-A947-70E740481C1C}">
                                                 <a14:useLocalDpi xmlns:a14="http://schemas.microsoft.com/office/drawing/2010/main" val="0"/>
@@ -9791,7 +9795,7 @@
                               </w:rPr>
                               <w:t xml:space="preserve"> </w:t>
                             </w:r>
-                            <w:hyperlink r:id="rId32" w:history="1">
+                            <w:hyperlink r:id="rId37" w:history="1">
                               <w:r>
                                 <w:rPr>
                                   <w:rStyle w:val="Hyperlink"/>
@@ -9976,7 +9980,7 @@
                             <wp:extent cx="1655445" cy="955040"/>
                             <wp:effectExtent l="0" t="0" r="1905" b="0"/>
                             <wp:docPr id="7" name="Picture 7" descr="A picture containing text, electronics&#10;&#10;Description automatically generated">
-                              <a:hlinkClick xmlns:a="http://schemas.openxmlformats.org/drawingml/2006/main" r:id="rId32"/>
+                              <a:hlinkClick xmlns:a="http://schemas.openxmlformats.org/drawingml/2006/main" r:id="rId38"/>
                             </wp:docPr>
                             <wp:cNvGraphicFramePr>
                               <a:graphicFrameLocks xmlns:a="http://schemas.openxmlformats.org/drawingml/2006/main" noChangeAspect="1"/>
@@ -9986,14 +9990,14 @@
                                 <pic:pic xmlns:pic="http://schemas.openxmlformats.org/drawingml/2006/picture">
                                   <pic:nvPicPr>
                                     <pic:cNvPr id="11" name="Picture 11" descr="A picture containing text, electronics&#10;&#10;Description automatically generated">
-                                      <a:hlinkClick r:id="rId32"/>
+                                      <a:hlinkClick r:id="rId38"/>
                                     </pic:cNvPr>
                                     <pic:cNvPicPr>
                                       <a:picLocks noChangeAspect="1"/>
                                     </pic:cNvPicPr>
                                   </pic:nvPicPr>
                                   <pic:blipFill>
-                                    <a:blip r:embed="rId31">
+                                    <a:blip r:embed="rId39">
                                       <a:extLst>
                                         <a:ext uri="{28A0092B-C50C-407E-A947-70E740481C1C}">
                                           <a14:useLocalDpi xmlns:a14="http://schemas.microsoft.com/office/drawing/2010/main" val="0"/>
@@ -10107,7 +10111,7 @@
                         </w:rPr>
                         <w:t xml:space="preserve"> </w:t>
                       </w:r>
-                      <w:hyperlink r:id="rId33" w:history="1">
+                      <w:hyperlink r:id="rId40" w:history="1">
                         <w:r>
                           <w:rPr>
                             <w:rStyle w:val="Hyperlink"/>
@@ -11783,12 +11787,12 @@
       </w:r>
     </w:p>
     <w:sectPr>
-      <w:headerReference w:type="even" r:id="rId34"/>
-      <w:headerReference w:type="default" r:id="rId35"/>
-      <w:footerReference w:type="even" r:id="rId36"/>
-      <w:footerReference w:type="default" r:id="rId37"/>
-      <w:headerReference w:type="first" r:id="rId38"/>
-      <w:footerReference w:type="first" r:id="rId39"/>
+      <w:headerReference w:type="even" r:id="rId41"/>
+      <w:headerReference w:type="default" r:id="rId42"/>
+      <w:footerReference w:type="even" r:id="rId43"/>
+      <w:footerReference w:type="default" r:id="rId44"/>
+      <w:headerReference w:type="first" r:id="rId45"/>
+      <w:footerReference w:type="first" r:id="rId46"/>
       <w:pgSz w:w="12240" w:h="15840"/>
       <w:pgMar w:top="900" w:right="1440" w:bottom="1170" w:left="1440" w:header="720" w:footer="720" w:gutter="0"/>
       <w:cols w:space="720"/>

</xml_diff>